<commit_message>
Update SCW16 ToR outputs
</commit_message>
<xml_diff>
--- a/docs/JMWG_Benchmark_ToR.docx
+++ b/docs/JMWG_Benchmark_ToR.docx
@@ -2,30 +2,6 @@
 <file path=word/document.xml><?xml version="1.0" encoding="utf-8"?>
 <w:document xmlns:w="http://schemas.openxmlformats.org/wordprocessingml/2006/main" xmlns:m="http://schemas.openxmlformats.org/officeDocument/2006/math" xmlns:r="http://schemas.openxmlformats.org/officeDocument/2006/relationships" xmlns:o="urn:schemas-microsoft-com:office:office" xmlns:v="urn:schemas-microsoft-com:vml" xmlns:w10="urn:schemas-microsoft-com:office:word" xmlns:a="http://schemas.openxmlformats.org/drawingml/2006/main" xmlns:pic="http://schemas.openxmlformats.org/drawingml/2006/picture" xmlns:wp="http://schemas.openxmlformats.org/drawingml/2006/wordprocessingDrawing">
   <w:body>
-    <w:p>
-      <w:pPr>
-        <w:pStyle w:val="Title"/>
-      </w:pPr>
-      <w:r>
-        <w:t xml:space="preserve">SCW16 JACK MACKEREL BENCHMARK WORKSHOP 2026</w:t>
-      </w:r>
-    </w:p>
-    <w:p>
-      <w:pPr>
-        <w:pStyle w:val="Subtitle"/>
-      </w:pPr>
-      <w:r>
-        <w:t xml:space="preserve">Terms of Reference</w:t>
-      </w:r>
-    </w:p>
-    <w:p>
-      <w:pPr>
-        <w:pStyle w:val="Date"/>
-      </w:pPr>
-      <w:r>
-        <w:t xml:space="preserve">2022-05-18</w:t>
-      </w:r>
-    </w:p>
     <w:sdt>
       <w:sdtPr>
         <w:docPartObj>
@@ -163,7 +139,7 @@
         <w:pStyle w:val="BodyText"/>
       </w:pPr>
       <w:r>
-        <w:t xml:space="preserve">01 April 2026</w:t>
+        <w:t xml:space="preserve">02 April 2026</w:t>
       </w:r>
     </w:p>
     <w:bookmarkStart w:id="23" w:name="terms-of-reference"/>

</xml_diff>

<commit_message>
Rebuild full published site outputs
</commit_message>
<xml_diff>
--- a/docs/JMWG_Benchmark_ToR.docx
+++ b/docs/JMWG_Benchmark_ToR.docx
@@ -139,7 +139,7 @@
         <w:pStyle w:val="BodyText"/>
       </w:pPr>
       <w:r>
-        <w:t xml:space="preserve">04 April 2026</w:t>
+        <w:t xml:space="preserve">08 April 2026</w:t>
       </w:r>
     </w:p>
     <w:bookmarkStart w:id="23" w:name="terms-of-reference"/>
@@ -517,12 +517,6 @@
       </w:pPr>
       <w:r>
         <w:t xml:space="preserve">The workshop welcomes scientists and technical experts from SPRFMO member states and cooperating entities with expertise in: population modeling, acoustic and trawl survey methodology, CPUE standardization, spatio-temporal modeling, fishery data analysis, selectivity estimation, and regional fisheries knowledge.</w:t>
-      </w:r>
-      <w:r>
-        <w:t xml:space="preserve"> </w:t>
-      </w:r>
-      <w:r>
-        <w:t xml:space="preserve">Ms Lee Qi has been invited to support the workshop, given her relevant expertise and long-standing knowledge of the jack mackerel stock in SPRFMO.</w:t>
       </w:r>
     </w:p>
     <w:bookmarkEnd w:id="30"/>

</xml_diff>